<commit_message>
exp(baseline-report): regenerate via MP-MD-ADAPTER — embarrassment fixed
The 0.4.0a1 baseline_report.docx was generated through gemma3:4b's LLM
output, which serialized markdown tables as parallel paragraphs (a "Cell"
column header followed by 5 standalone Normal-styled paragraphs per row).

Phase-13 step-1 ships MP-MD-ADAPTER which extracts structure
deterministically. Regenerating the same document through it produces:
  sections=9 (vs ad-hoc grouping the LLM made)
  tables=3 (matches the source markdown — 3 actual tables)
  saved size: 40264 bytes
  lenient: True

The saved word/document.xml contains 3 actual <w:tbl> elements (verified
by zip-grep), proving the regression is closed: the document now reads as
intended in Word with proper table rendering, not flattened text.

This is the V-MP-MD-ADAPTER scenario-9 evidence on the real source file
(test fixture is a smaller excerpt). 0 LLM calls in this regeneration —
deterministic adapter only.
</commit_message>
<xml_diff>
--- a/experiments/2026-05-10-alpha-baseline/baseline_report.docx
+++ b/experiments/2026-05-10-alpha-baseline/baseline_report.docx
@@ -27,12 +27,12 @@
         <w:pStyle w:val="Heading1"/>
       </w:pPr>
       <w:r>
-        <w:t>Introduction</w:t>
+        <w:t>MINT Article Experiment — Rounds 1, 2, 3</w:t>
       </w:r>
     </w:p>
     <w:p>
       <w:r>
-        <w:t>Three rounds of the same 6+2 matrix on the same prompt against the same Ollama endpoint at `10.128.26.10:11434`. The only deltas between rounds:</w:t>
+        <w:t>Three rounds of the same 6+2 matrix on the same prompt against the same Ollama endpoint at 10.128.26.10:11434. The only deltas between rounds:</w:t>
       </w:r>
     </w:p>
     <w:p>
@@ -40,7 +40,7 @@
         <w:pStyle w:val="ListBullet"/>
       </w:pPr>
       <w:r>
-        <w:t>R1 runner: 1 + 1 attempts, retry only on JSON-parse failure, schema failures terminated the cell.</w:t>
+        <w:t>R1 runner: 1 + 1 attempts, retry only on JSON-parse failure, schema failures terminated the cell. Bug in error reporting: last_err from earlier attempts was carried through even when a later attempt succeeded (gemma4:e2b in R1 was reported with a misleading error string).</w:t>
       </w:r>
     </w:p>
     <w:p>
@@ -48,7 +48,7 @@
         <w:pStyle w:val="ListBullet"/>
       </w:pPr>
       <w:r>
-        <w:t>R2 runner: 1 + 2 attempts (3 total), retry on any of: timeout-free call error, no-JSON-found, JSON-parse-fail, schema-validation-fail, with per-failure-type targeted hints in the retry prompt.</w:t>
+        <w:t>R2 runner: 1 + 2 attempts (3 total), retry on any of: timeout-free call error, no-JSON-found, JSON-parse-fail, schema-validation-fail, with per-failure-type targeted hints in the retry prompt. last_err cleared after the schema gate passes.</w:t>
       </w:r>
     </w:p>
     <w:p>
@@ -56,35 +56,26 @@
         <w:pStyle w:val="ListBullet"/>
       </w:pPr>
       <w:r>
-        <w:t>R3 (post-fix preset wiring): same runner as R2, but on 0.4.0a2 with the `apply_preset_to_doc` fix landed. R1 and R2 shipped under a bug where `with_style_preset()` only loaded the preset DATA but never consumed it during render — `add_heading()` went through python-docx's stock theme, so klawd's typography was visually invisible. R3 is the first round where the saved docx files actually carry klawd's #1B3A5C / Arial / 16pt heading style and #333333 body.</w:t>
+        <w:t>R3 (post-fix preset wiring): same runner as R2, but on 0.4.0a2 with the apply_preset_to_doc fix landed. R1 and R2 shipped under a bug where with_style_preset() only loaded the preset DATA but never consumed it during render — add_heading() went through python-docx's stock theme, so klawd's typography was visually invisible. R3 is the first round where the saved docx files actually carry klawd's #1B3A5C / Arial / 16pt heading style and #333333 body.</w:t>
+      </w:r>
+    </w:p>
+    <w:p>
+      <w:r>
+        <w:t xml:space="preserve">Total wall time: R1 = 23.2 min, R2 = 18.2 min, </w:t>
+      </w:r>
+      <w:r>
+        <w:rPr>
+          <w:b/>
+        </w:rPr>
+        <w:t>R3 = 42.6 min</w:t>
+      </w:r>
+      <w:r>
+        <w:t xml:space="preserve"> (heavy tier was unusually flaky on R3; cell 1 alone took 10.4 min vs 4.3 min in R2).</w:t>
       </w:r>
     </w:p>
     <w:p>
       <w:pPr>
         <w:pStyle w:val="Heading2"/>
-      </w:pPr>
-      <w:r>
-        <w:t>Rounds 1, 2, and 3 Summary</w:t>
-      </w:r>
-    </w:p>
-    <w:p>
-      <w:r>
-        <w:t>Total wall time: R1 = 23.2 min, R2 = 18.2 min, **R3 = 42.6 min** (heavy tier was unusually flaky on R3; cell 1 alone took 10.4 min vs 4.3 min in R2).</w:t>
-      </w:r>
-    </w:p>
-    <w:p>
-      <w:pPr>
-        <w:sectPr>
-          <w:pgSz w:w="12240" w:h="15840"/>
-          <w:pgMar w:top="1440" w:right="1800" w:bottom="1440" w:left="1800" w:header="720" w:footer="720" w:gutter="0"/>
-          <w:cols w:space="720"/>
-          <w:docGrid w:linePitch="360"/>
-        </w:sectPr>
-      </w:pPr>
-    </w:p>
-    <w:p>
-      <w:pPr>
-        <w:pStyle w:val="Heading1"/>
       </w:pPr>
       <w:r>
         <w:t>Per-cell comparison</w:t>
@@ -97,16 +88,30 @@
         <w:tblLook w:firstColumn="1" w:firstRow="1" w:lastColumn="0" w:lastRow="0" w:noHBand="0" w:noVBand="1" w:val="04A0"/>
       </w:tblPr>
       <w:tblGrid>
-        <w:gridCol w:w="1872"/>
-        <w:gridCol w:w="1872"/>
-        <w:gridCol w:w="1872"/>
-        <w:gridCol w:w="1872"/>
-        <w:gridCol w:w="1872"/>
+        <w:gridCol w:w="1440"/>
+        <w:gridCol w:w="1440"/>
+        <w:gridCol w:w="1440"/>
+        <w:gridCol w:w="1440"/>
+        <w:gridCol w:w="1440"/>
+        <w:gridCol w:w="1440"/>
       </w:tblGrid>
       <w:tr>
         <w:tc>
           <w:tcPr>
-            <w:tcW w:type="dxa" w:w="1872"/>
+            <w:tcW w:type="dxa" w:w="1440"/>
+          </w:tcPr>
+          <w:p>
+            <w:r>
+              <w:rPr>
+                <w:b/>
+              </w:rPr>
+              <w:t>Cell</w:t>
+            </w:r>
+          </w:p>
+        </w:tc>
+        <w:tc>
+          <w:tcPr>
+            <w:tcW w:type="dxa" w:w="1440"/>
           </w:tcPr>
           <w:p>
             <w:r>
@@ -119,7 +124,7 @@
         </w:tc>
         <w:tc>
           <w:tcPr>
-            <w:tcW w:type="dxa" w:w="1872"/>
+            <w:tcW w:type="dxa" w:w="1440"/>
           </w:tcPr>
           <w:p>
             <w:r>
@@ -132,7 +137,7 @@
         </w:tc>
         <w:tc>
           <w:tcPr>
-            <w:tcW w:type="dxa" w:w="1872"/>
+            <w:tcW w:type="dxa" w:w="1440"/>
           </w:tcPr>
           <w:p>
             <w:r>
@@ -145,7 +150,7 @@
         </w:tc>
         <w:tc>
           <w:tcPr>
-            <w:tcW w:type="dxa" w:w="1872"/>
+            <w:tcW w:type="dxa" w:w="1440"/>
           </w:tcPr>
           <w:p>
             <w:r>
@@ -158,7 +163,7 @@
         </w:tc>
         <w:tc>
           <w:tcPr>
-            <w:tcW w:type="dxa" w:w="1872"/>
+            <w:tcW w:type="dxa" w:w="1440"/>
           </w:tcPr>
           <w:p>
             <w:r>
@@ -173,7 +178,17 @@
       <w:tr>
         <w:tc>
           <w:tcPr>
-            <w:tcW w:type="dxa" w:w="1872"/>
+            <w:tcW w:type="dxa" w:w="1440"/>
+          </w:tcPr>
+          <w:p>
+            <w:r>
+              <w:t>01</w:t>
+            </w:r>
+          </w:p>
+        </w:tc>
+        <w:tc>
+          <w:tcPr>
+            <w:tcW w:type="dxa" w:w="1440"/>
           </w:tcPr>
           <w:p>
             <w:r>
@@ -183,7 +198,7 @@
         </w:tc>
         <w:tc>
           <w:tcPr>
-            <w:tcW w:type="dxa" w:w="1872"/>
+            <w:tcW w:type="dxa" w:w="1440"/>
           </w:tcPr>
           <w:p>
             <w:r>
@@ -193,7 +208,7 @@
         </w:tc>
         <w:tc>
           <w:tcPr>
-            <w:tcW w:type="dxa" w:w="1872"/>
+            <w:tcW w:type="dxa" w:w="1440"/>
           </w:tcPr>
           <w:p>
             <w:r>
@@ -203,7 +218,7 @@
         </w:tc>
         <w:tc>
           <w:tcPr>
-            <w:tcW w:type="dxa" w:w="1872"/>
+            <w:tcW w:type="dxa" w:w="1440"/>
           </w:tcPr>
           <w:p>
             <w:r>
@@ -213,7 +228,7 @@
         </w:tc>
         <w:tc>
           <w:tcPr>
-            <w:tcW w:type="dxa" w:w="1872"/>
+            <w:tcW w:type="dxa" w:w="1440"/>
           </w:tcPr>
           <w:p>
             <w:r>
@@ -225,7 +240,17 @@
       <w:tr>
         <w:tc>
           <w:tcPr>
-            <w:tcW w:type="dxa" w:w="1872"/>
+            <w:tcW w:type="dxa" w:w="1440"/>
+          </w:tcPr>
+          <w:p>
+            <w:r>
+              <w:t>02</w:t>
+            </w:r>
+          </w:p>
+        </w:tc>
+        <w:tc>
+          <w:tcPr>
+            <w:tcW w:type="dxa" w:w="1440"/>
           </w:tcPr>
           <w:p>
             <w:r>
@@ -235,7 +260,7 @@
         </w:tc>
         <w:tc>
           <w:tcPr>
-            <w:tcW w:type="dxa" w:w="1872"/>
+            <w:tcW w:type="dxa" w:w="1440"/>
           </w:tcPr>
           <w:p>
             <w:r>
@@ -245,7 +270,7 @@
         </w:tc>
         <w:tc>
           <w:tcPr>
-            <w:tcW w:type="dxa" w:w="1872"/>
+            <w:tcW w:type="dxa" w:w="1440"/>
           </w:tcPr>
           <w:p>
             <w:r>
@@ -255,7 +280,7 @@
         </w:tc>
         <w:tc>
           <w:tcPr>
-            <w:tcW w:type="dxa" w:w="1872"/>
+            <w:tcW w:type="dxa" w:w="1440"/>
           </w:tcPr>
           <w:p>
             <w:r>
@@ -265,7 +290,7 @@
         </w:tc>
         <w:tc>
           <w:tcPr>
-            <w:tcW w:type="dxa" w:w="1872"/>
+            <w:tcW w:type="dxa" w:w="1440"/>
           </w:tcPr>
           <w:p>
             <w:r>
@@ -277,7 +302,17 @@
       <w:tr>
         <w:tc>
           <w:tcPr>
-            <w:tcW w:type="dxa" w:w="1872"/>
+            <w:tcW w:type="dxa" w:w="1440"/>
+          </w:tcPr>
+          <w:p>
+            <w:r>
+              <w:t>03</w:t>
+            </w:r>
+          </w:p>
+        </w:tc>
+        <w:tc>
+          <w:tcPr>
+            <w:tcW w:type="dxa" w:w="1440"/>
           </w:tcPr>
           <w:p>
             <w:r>
@@ -287,7 +322,7 @@
         </w:tc>
         <w:tc>
           <w:tcPr>
-            <w:tcW w:type="dxa" w:w="1872"/>
+            <w:tcW w:type="dxa" w:w="1440"/>
           </w:tcPr>
           <w:p>
             <w:r>
@@ -297,17 +332,17 @@
         </w:tc>
         <w:tc>
           <w:tcPr>
-            <w:tcW w:type="dxa" w:w="1872"/>
+            <w:tcW w:type="dxa" w:w="1440"/>
           </w:tcPr>
           <w:p>
             <w:r>
-              <w:t>✗ FAIL 258s — `Thinking Process:` prose</w:t>
+              <w:t>✗ FAIL 258s — Thinking Process: prose</w:t>
             </w:r>
           </w:p>
         </w:tc>
         <w:tc>
           <w:tcPr>
-            <w:tcW w:type="dxa" w:w="1872"/>
+            <w:tcW w:type="dxa" w:w="1440"/>
           </w:tcPr>
           <w:p>
             <w:r>
@@ -317,7 +352,7 @@
         </w:tc>
         <w:tc>
           <w:tcPr>
-            <w:tcW w:type="dxa" w:w="1872"/>
+            <w:tcW w:type="dxa" w:w="1440"/>
           </w:tcPr>
           <w:p>
             <w:r>
@@ -329,7 +364,17 @@
       <w:tr>
         <w:tc>
           <w:tcPr>
-            <w:tcW w:type="dxa" w:w="1872"/>
+            <w:tcW w:type="dxa" w:w="1440"/>
+          </w:tcPr>
+          <w:p>
+            <w:r>
+              <w:t>04</w:t>
+            </w:r>
+          </w:p>
+        </w:tc>
+        <w:tc>
+          <w:tcPr>
+            <w:tcW w:type="dxa" w:w="1440"/>
           </w:tcPr>
           <w:p>
             <w:r>
@@ -339,7 +384,7 @@
         </w:tc>
         <w:tc>
           <w:tcPr>
-            <w:tcW w:type="dxa" w:w="1872"/>
+            <w:tcW w:type="dxa" w:w="1440"/>
           </w:tcPr>
           <w:p>
             <w:r>
@@ -349,7 +394,7 @@
         </w:tc>
         <w:tc>
           <w:tcPr>
-            <w:tcW w:type="dxa" w:w="1872"/>
+            <w:tcW w:type="dxa" w:w="1440"/>
           </w:tcPr>
           <w:p>
             <w:r>
@@ -359,17 +404,17 @@
         </w:tc>
         <w:tc>
           <w:tcPr>
-            <w:tcW w:type="dxa" w:w="1872"/>
+            <w:tcW w:type="dxa" w:w="1440"/>
           </w:tcPr>
           <w:p>
             <w:r>
-              <w:t>✅ OK **11s**</w:t>
+              <w:t>✅ OK 11s</w:t>
             </w:r>
           </w:p>
         </w:tc>
         <w:tc>
           <w:tcPr>
-            <w:tcW w:type="dxa" w:w="1872"/>
+            <w:tcW w:type="dxa" w:w="1440"/>
           </w:tcPr>
           <w:p>
             <w:r>
@@ -381,7 +426,17 @@
       <w:tr>
         <w:tc>
           <w:tcPr>
-            <w:tcW w:type="dxa" w:w="1872"/>
+            <w:tcW w:type="dxa" w:w="1440"/>
+          </w:tcPr>
+          <w:p>
+            <w:r>
+              <w:t>05</w:t>
+            </w:r>
+          </w:p>
+        </w:tc>
+        <w:tc>
+          <w:tcPr>
+            <w:tcW w:type="dxa" w:w="1440"/>
           </w:tcPr>
           <w:p>
             <w:r>
@@ -391,7 +446,7 @@
         </w:tc>
         <w:tc>
           <w:tcPr>
-            <w:tcW w:type="dxa" w:w="1872"/>
+            <w:tcW w:type="dxa" w:w="1440"/>
           </w:tcPr>
           <w:p>
             <w:r>
@@ -401,7 +456,7 @@
         </w:tc>
         <w:tc>
           <w:tcPr>
-            <w:tcW w:type="dxa" w:w="1872"/>
+            <w:tcW w:type="dxa" w:w="1440"/>
           </w:tcPr>
           <w:p>
             <w:r>
@@ -411,7 +466,7 @@
         </w:tc>
         <w:tc>
           <w:tcPr>
-            <w:tcW w:type="dxa" w:w="1872"/>
+            <w:tcW w:type="dxa" w:w="1440"/>
           </w:tcPr>
           <w:p>
             <w:r>
@@ -421,7 +476,7 @@
         </w:tc>
         <w:tc>
           <w:tcPr>
-            <w:tcW w:type="dxa" w:w="1872"/>
+            <w:tcW w:type="dxa" w:w="1440"/>
           </w:tcPr>
           <w:p>
             <w:r>
@@ -433,7 +488,17 @@
       <w:tr>
         <w:tc>
           <w:tcPr>
-            <w:tcW w:type="dxa" w:w="1872"/>
+            <w:tcW w:type="dxa" w:w="1440"/>
+          </w:tcPr>
+          <w:p>
+            <w:r>
+              <w:t>06</w:t>
+            </w:r>
+          </w:p>
+        </w:tc>
+        <w:tc>
+          <w:tcPr>
+            <w:tcW w:type="dxa" w:w="1440"/>
           </w:tcPr>
           <w:p>
             <w:r>
@@ -443,7 +508,7 @@
         </w:tc>
         <w:tc>
           <w:tcPr>
-            <w:tcW w:type="dxa" w:w="1872"/>
+            <w:tcW w:type="dxa" w:w="1440"/>
           </w:tcPr>
           <w:p>
             <w:r>
@@ -453,7 +518,7 @@
         </w:tc>
         <w:tc>
           <w:tcPr>
-            <w:tcW w:type="dxa" w:w="1872"/>
+            <w:tcW w:type="dxa" w:w="1440"/>
           </w:tcPr>
           <w:p>
             <w:r>
@@ -463,7 +528,7 @@
         </w:tc>
         <w:tc>
           <w:tcPr>
-            <w:tcW w:type="dxa" w:w="1872"/>
+            <w:tcW w:type="dxa" w:w="1440"/>
           </w:tcPr>
           <w:p>
             <w:r>
@@ -473,7 +538,7 @@
         </w:tc>
         <w:tc>
           <w:tcPr>
-            <w:tcW w:type="dxa" w:w="1872"/>
+            <w:tcW w:type="dxa" w:w="1440"/>
           </w:tcPr>
           <w:p>
             <w:r>
@@ -485,7 +550,17 @@
       <w:tr>
         <w:tc>
           <w:tcPr>
-            <w:tcW w:type="dxa" w:w="1872"/>
+            <w:tcW w:type="dxa" w:w="1440"/>
+          </w:tcPr>
+          <w:p>
+            <w:r>
+              <w:t>07</w:t>
+            </w:r>
+          </w:p>
+        </w:tc>
+        <w:tc>
+          <w:tcPr>
+            <w:tcW w:type="dxa" w:w="1440"/>
           </w:tcPr>
           <w:p>
             <w:r>
@@ -495,7 +570,7 @@
         </w:tc>
         <w:tc>
           <w:tcPr>
-            <w:tcW w:type="dxa" w:w="1872"/>
+            <w:tcW w:type="dxa" w:w="1440"/>
           </w:tcPr>
           <w:p>
             <w:r>
@@ -505,7 +580,7 @@
         </w:tc>
         <w:tc>
           <w:tcPr>
-            <w:tcW w:type="dxa" w:w="1872"/>
+            <w:tcW w:type="dxa" w:w="1440"/>
           </w:tcPr>
           <w:p>
             <w:r>
@@ -515,7 +590,7 @@
         </w:tc>
         <w:tc>
           <w:tcPr>
-            <w:tcW w:type="dxa" w:w="1872"/>
+            <w:tcW w:type="dxa" w:w="1440"/>
           </w:tcPr>
           <w:p>
             <w:r>
@@ -525,7 +600,7 @@
         </w:tc>
         <w:tc>
           <w:tcPr>
-            <w:tcW w:type="dxa" w:w="1872"/>
+            <w:tcW w:type="dxa" w:w="1440"/>
           </w:tcPr>
           <w:p>
             <w:r>
@@ -537,7 +612,17 @@
       <w:tr>
         <w:tc>
           <w:tcPr>
-            <w:tcW w:type="dxa" w:w="1872"/>
+            <w:tcW w:type="dxa" w:w="1440"/>
+          </w:tcPr>
+          <w:p>
+            <w:r>
+              <w:t>08</w:t>
+            </w:r>
+          </w:p>
+        </w:tc>
+        <w:tc>
+          <w:tcPr>
+            <w:tcW w:type="dxa" w:w="1440"/>
           </w:tcPr>
           <w:p>
             <w:r>
@@ -547,7 +632,7 @@
         </w:tc>
         <w:tc>
           <w:tcPr>
-            <w:tcW w:type="dxa" w:w="1872"/>
+            <w:tcW w:type="dxa" w:w="1440"/>
           </w:tcPr>
           <w:p>
             <w:r>
@@ -557,7 +642,7 @@
         </w:tc>
         <w:tc>
           <w:tcPr>
-            <w:tcW w:type="dxa" w:w="1872"/>
+            <w:tcW w:type="dxa" w:w="1440"/>
           </w:tcPr>
           <w:p>
             <w:r>
@@ -567,7 +652,7 @@
         </w:tc>
         <w:tc>
           <w:tcPr>
-            <w:tcW w:type="dxa" w:w="1872"/>
+            <w:tcW w:type="dxa" w:w="1440"/>
           </w:tcPr>
           <w:p>
             <w:r>
@@ -577,7 +662,7 @@
         </w:tc>
         <w:tc>
           <w:tcPr>
-            <w:tcW w:type="dxa" w:w="1872"/>
+            <w:tcW w:type="dxa" w:w="1440"/>
           </w:tcPr>
           <w:p>
             <w:r>
@@ -589,7 +674,7 @@
     </w:tbl>
     <w:p>
       <w:pPr>
-        <w:pStyle w:val="Heading1"/>
+        <w:pStyle w:val="Heading2"/>
       </w:pPr>
       <w:r>
         <w:t>Aggregate</w:t>
@@ -602,14 +687,27 @@
         <w:tblLook w:firstColumn="1" w:firstRow="1" w:lastColumn="0" w:lastRow="0" w:noHBand="0" w:noVBand="1" w:val="04A0"/>
       </w:tblPr>
       <w:tblGrid>
-        <w:gridCol w:w="3120"/>
-        <w:gridCol w:w="3120"/>
-        <w:gridCol w:w="3120"/>
+        <w:gridCol w:w="2160"/>
+        <w:gridCol w:w="2160"/>
+        <w:gridCol w:w="2160"/>
+        <w:gridCol w:w="2160"/>
       </w:tblGrid>
       <w:tr>
         <w:tc>
           <w:tcPr>
-            <w:tcW w:type="dxa" w:w="3120"/>
+            <w:tcW w:type="dxa" w:w="2160"/>
+          </w:tcPr>
+          <w:p>
+            <w:r>
+              <w:rPr>
+                <w:b/>
+              </w:rPr>
+            </w:r>
+          </w:p>
+        </w:tc>
+        <w:tc>
+          <w:tcPr>
+            <w:tcW w:type="dxa" w:w="2160"/>
           </w:tcPr>
           <w:p>
             <w:r>
@@ -622,7 +720,7 @@
         </w:tc>
         <w:tc>
           <w:tcPr>
-            <w:tcW w:type="dxa" w:w="3120"/>
+            <w:tcW w:type="dxa" w:w="2160"/>
           </w:tcPr>
           <w:p>
             <w:r>
@@ -635,7 +733,7 @@
         </w:tc>
         <w:tc>
           <w:tcPr>
-            <w:tcW w:type="dxa" w:w="3120"/>
+            <w:tcW w:type="dxa" w:w="2160"/>
           </w:tcPr>
           <w:p>
             <w:r>
@@ -650,7 +748,101 @@
       <w:tr>
         <w:tc>
           <w:tcPr>
-            <w:tcW w:type="dxa" w:w="3120"/>
+            <w:tcW w:type="dxa" w:w="2160"/>
+          </w:tcPr>
+          <w:p>
+            <w:r>
+              <w:t>Heavy tier (3)</w:t>
+            </w:r>
+          </w:p>
+        </w:tc>
+        <w:tc>
+          <w:tcPr>
+            <w:tcW w:type="dxa" w:w="2160"/>
+          </w:tcPr>
+          <w:p>
+            <w:r>
+              <w:t>0/3</w:t>
+            </w:r>
+          </w:p>
+        </w:tc>
+        <w:tc>
+          <w:tcPr>
+            <w:tcW w:type="dxa" w:w="2160"/>
+          </w:tcPr>
+          <w:p>
+            <w:r>
+              <w:t>2/3</w:t>
+            </w:r>
+          </w:p>
+        </w:tc>
+        <w:tc>
+          <w:tcPr>
+            <w:tcW w:type="dxa" w:w="2160"/>
+          </w:tcPr>
+          <w:p>
+            <w:r>
+              <w:t>1/3</w:t>
+            </w:r>
+          </w:p>
+        </w:tc>
+      </w:tr>
+      <w:tr>
+        <w:tc>
+          <w:tcPr>
+            <w:tcW w:type="dxa" w:w="2160"/>
+          </w:tcPr>
+          <w:p>
+            <w:r>
+              <w:t>Light tier (3)</w:t>
+            </w:r>
+          </w:p>
+        </w:tc>
+        <w:tc>
+          <w:tcPr>
+            <w:tcW w:type="dxa" w:w="2160"/>
+          </w:tcPr>
+          <w:p>
+            <w:r>
+              <w:t>3/3</w:t>
+            </w:r>
+          </w:p>
+        </w:tc>
+        <w:tc>
+          <w:tcPr>
+            <w:tcW w:type="dxa" w:w="2160"/>
+          </w:tcPr>
+          <w:p>
+            <w:r>
+              <w:t>3/3</w:t>
+            </w:r>
+          </w:p>
+        </w:tc>
+        <w:tc>
+          <w:tcPr>
+            <w:tcW w:type="dxa" w:w="2160"/>
+          </w:tcPr>
+          <w:p>
+            <w:r>
+              <w:t>2/3</w:t>
+            </w:r>
+          </w:p>
+        </w:tc>
+      </w:tr>
+      <w:tr>
+        <w:tc>
+          <w:tcPr>
+            <w:tcW w:type="dxa" w:w="2160"/>
+          </w:tcPr>
+          <w:p>
+            <w:r>
+              <w:t>Total</w:t>
+            </w:r>
+          </w:p>
+        </w:tc>
+        <w:tc>
+          <w:tcPr>
+            <w:tcW w:type="dxa" w:w="2160"/>
           </w:tcPr>
           <w:p>
             <w:r>
@@ -660,7 +852,7 @@
         </w:tc>
         <w:tc>
           <w:tcPr>
-            <w:tcW w:type="dxa" w:w="3120"/>
+            <w:tcW w:type="dxa" w:w="2160"/>
           </w:tcPr>
           <w:p>
             <w:r>
@@ -670,7 +862,7 @@
         </w:tc>
         <w:tc>
           <w:tcPr>
-            <w:tcW w:type="dxa" w:w="3120"/>
+            <w:tcW w:type="dxa" w:w="2160"/>
           </w:tcPr>
           <w:p>
             <w:r>
@@ -682,26 +874,20 @@
     </w:tbl>
     <w:p>
       <w:r>
-        <w:t>R3 success count regressed not because of the preset fix (which is purely visual), but because the bank server was under heavier load that day plus inherent run-to-run variance — `gemma4:e2b` flaked on a JSON parse error this round; in R2 the same cell parsed cleanly. None of the failures in R3 were caused by the fix.</w:t>
+        <w:t>R3 success count regressed not because of the preset fix (which is purely visual), but because the bank server was under heavier load that day plus inherent run-to-run variance — gemma4:e2b flaked on a JSON parse error this round; in R2 the same cell parsed cleanly. None of the failures in R3 were caused by the fix.</w:t>
       </w:r>
     </w:p>
     <w:p>
       <w:pPr>
-        <w:sectPr>
-          <w:headerReference w:type="default" r:id="rId9"/>
-          <w:pgSz w:w="12240" w:h="15840"/>
-          <w:pgMar w:top="1440" w:right="1440" w:bottom="1440" w:left="1440" w:header="720" w:footer="720" w:gutter="0"/>
-          <w:docGrid w:linePitch="360"/>
-          <w:cols w:num="3" w:space="720"/>
-        </w:sectPr>
-      </w:pPr>
-    </w:p>
-    <w:p>
-      <w:pPr>
-        <w:pStyle w:val="Heading1"/>
+        <w:pStyle w:val="Heading2"/>
       </w:pPr>
       <w:r>
         <w:t>Visual-fidelity delta — the actual point of R3</w:t>
+      </w:r>
+    </w:p>
+    <w:p>
+      <w:r>
+        <w:t>For every cell that succeeded in BOTH R2 and R3, the saved word/styles.xml went from "Word default theme" to "klawd applied":</w:t>
       </w:r>
     </w:p>
     <w:tbl>
@@ -711,14 +897,14 @@
         <w:tblLook w:firstColumn="1" w:firstRow="1" w:lastColumn="0" w:lastRow="0" w:noHBand="0" w:noVBand="1" w:val="04A0"/>
       </w:tblPr>
       <w:tblGrid>
-        <w:gridCol w:w="3120"/>
-        <w:gridCol w:w="3120"/>
-        <w:gridCol w:w="3120"/>
+        <w:gridCol w:w="2880"/>
+        <w:gridCol w:w="2880"/>
+        <w:gridCol w:w="2880"/>
       </w:tblGrid>
       <w:tr>
         <w:tc>
           <w:tcPr>
-            <w:tcW w:type="dxa" w:w="3120"/>
+            <w:tcW w:type="dxa" w:w="2880"/>
           </w:tcPr>
           <w:p>
             <w:r>
@@ -731,7 +917,7 @@
         </w:tc>
         <w:tc>
           <w:tcPr>
-            <w:tcW w:type="dxa" w:w="3120"/>
+            <w:tcW w:type="dxa" w:w="2880"/>
           </w:tcPr>
           <w:p>
             <w:r>
@@ -744,7 +930,7 @@
         </w:tc>
         <w:tc>
           <w:tcPr>
-            <w:tcW w:type="dxa" w:w="3120"/>
+            <w:tcW w:type="dxa" w:w="2880"/>
           </w:tcPr>
           <w:p>
             <w:r>
@@ -759,7 +945,7 @@
       <w:tr>
         <w:tc>
           <w:tcPr>
-            <w:tcW w:type="dxa" w:w="3120"/>
+            <w:tcW w:type="dxa" w:w="2880"/>
           </w:tcPr>
           <w:p>
             <w:r>
@@ -769,7 +955,7 @@
         </w:tc>
         <w:tc>
           <w:tcPr>
-            <w:tcW w:type="dxa" w:w="3120"/>
+            <w:tcW w:type="dxa" w:w="2880"/>
           </w:tcPr>
           <w:p>
             <w:r>
@@ -779,11 +965,11 @@
         </w:tc>
         <w:tc>
           <w:tcPr>
-            <w:tcW w:type="dxa" w:w="3120"/>
+            <w:tcW w:type="dxa" w:w="2880"/>
           </w:tcPr>
           <w:p>
             <w:r>
-              <w:t>**color #1B3A5C, Arial, 16pt**</w:t>
+              <w:t>color #1B3A5C, Arial, 16pt</w:t>
             </w:r>
           </w:p>
         </w:tc>
@@ -791,7 +977,7 @@
       <w:tr>
         <w:tc>
           <w:tcPr>
-            <w:tcW w:type="dxa" w:w="3120"/>
+            <w:tcW w:type="dxa" w:w="2880"/>
           </w:tcPr>
           <w:p>
             <w:r>
@@ -801,7 +987,7 @@
         </w:tc>
         <w:tc>
           <w:tcPr>
-            <w:tcW w:type="dxa" w:w="3120"/>
+            <w:tcW w:type="dxa" w:w="2880"/>
           </w:tcPr>
           <w:p>
             <w:r>
@@ -811,11 +997,11 @@
         </w:tc>
         <w:tc>
           <w:tcPr>
-            <w:tcW w:type="dxa" w:w="3120"/>
+            <w:tcW w:type="dxa" w:w="2880"/>
           </w:tcPr>
           <w:p>
             <w:r>
-              <w:t>**color #1B3A5C, Arial, 16pt**</w:t>
+              <w:t>color #1B3A5C, Arial, 16pt</w:t>
             </w:r>
           </w:p>
         </w:tc>
@@ -823,7 +1009,7 @@
       <w:tr>
         <w:tc>
           <w:tcPr>
-            <w:tcW w:type="dxa" w:w="3120"/>
+            <w:tcW w:type="dxa" w:w="2880"/>
           </w:tcPr>
           <w:p>
             <w:r>
@@ -833,7 +1019,7 @@
         </w:tc>
         <w:tc>
           <w:tcPr>
-            <w:tcW w:type="dxa" w:w="3120"/>
+            <w:tcW w:type="dxa" w:w="2880"/>
           </w:tcPr>
           <w:p>
             <w:r>
@@ -843,11 +1029,11 @@
         </w:tc>
         <w:tc>
           <w:tcPr>
-            <w:tcW w:type="dxa" w:w="3120"/>
+            <w:tcW w:type="dxa" w:w="2880"/>
           </w:tcPr>
           <w:p>
             <w:r>
-              <w:t>**color #1B3A5C, Arial, 16pt**</w:t>
+              <w:t>color #1B3A5C, Arial, 16pt</w:t>
             </w:r>
           </w:p>
         </w:tc>
@@ -855,15 +1041,88 @@
     </w:tbl>
     <w:p>
       <w:r>
-        <w:t>Every R3 docx's `styles.xml` now contains `1B3A5C`, `Arial`, and `333333`. None of the R2 docx files do — they ship under the bug. **Open the R2 and R3 versions of the same cell side-by-side in Word and the difference is immediate.** Same content (the model produced the same JSON spec), same structure (sections + blocks), wholly different visual tone (Word default sans navy vs Anthropic baseline navy + Arial).</w:t>
+        <w:t xml:space="preserve">Every R3 docx's styles.xml now contains 1B3A5C, Arial, and 333333. None of the R2 docx files do — they ship under the bug. </w:t>
+      </w:r>
+      <w:r>
+        <w:rPr>
+          <w:b/>
+        </w:rPr>
+        <w:t>Open the R2 and R3 versions of the same cell side-by-side in Word and the difference is immediate.</w:t>
+      </w:r>
+      <w:r>
+        <w:t xml:space="preserve"> Same content (the model produced the same JSON spec), same structure (sections + blocks), wholly different visual tone (Word default sans navy vs Anthropic baseline navy + Arial).</w:t>
       </w:r>
     </w:p>
     <w:p>
       <w:pPr>
-        <w:pStyle w:val="Heading1"/>
+        <w:pStyle w:val="Heading3"/>
       </w:pPr>
       <w:r>
-        <w:t>Findings</w:t>
+        <w:t>1. The thesis holds: small models + pipeline produce frontier-quality docs</w:t>
+      </w:r>
+    </w:p>
+    <w:p>
+      <w:r>
+        <w:t xml:space="preserve">In </w:t>
+      </w:r>
+      <w:r>
+        <w:rPr>
+          <w:b/>
+        </w:rPr>
+        <w:t>both rounds</w:t>
+      </w:r>
+      <w:r>
+        <w:t xml:space="preserve">, all three light-tier models (4B / 5B / 9.7B) produced a valid klawd-themed .docx that passed lenient MP-VALIDATE on the very first attempt. The smallest — Gemma 3 4B — finished in </w:t>
+      </w:r>
+      <w:r>
+        <w:rPr>
+          <w:b/>
+        </w:rPr>
+        <w:t>11 seconds</w:t>
+      </w:r>
+      <w:r>
+        <w:t xml:space="preserve"> in R2.</w:t>
+      </w:r>
+    </w:p>
+    <w:p>
+      <w:r>
+        <w:t xml:space="preserve">Same models without the pipeline (cells 7 &amp; 8) only produce raw markdown. The </w:t>
+      </w:r>
+      <w:r>
+        <w:rPr>
+          <w:b/>
+        </w:rPr>
+        <w:t>deterministic builder + style preset</w:t>
+      </w:r>
+      <w:r>
+        <w:t xml:space="preserve"> is what turns "model output" into "polished branded document".</w:t>
+      </w:r>
+    </w:p>
+    <w:p>
+      <w:pPr>
+        <w:pStyle w:val="Heading3"/>
+      </w:pPr>
+      <w:r>
+        <w:t>2. Heavy models are not categorically better — they're more drift-prone</w:t>
+      </w:r>
+    </w:p>
+    <w:p>
+      <w:r>
+        <w:t xml:space="preserve">R1: 0/3 heavy succeeded. R2: 2/3 heavy succeeded — </w:t>
+      </w:r>
+      <w:r>
+        <w:rPr>
+          <w:b/>
+        </w:rPr>
+        <w:t>on the first attempt</w:t>
+      </w:r>
+      <w:r>
+        <w:t xml:space="preserve"> (retries=0).</w:t>
+      </w:r>
+    </w:p>
+    <w:p>
+      <w:r>
+        <w:t>This means the retry logic added in R2 was not the rescue — first-call variability was. The heavy 30B-class models in this lineup all have known reasoning-mode behaviour (qwen3.6, glm-4.7, gemma4 family). On any given call, they may:</w:t>
       </w:r>
     </w:p>
     <w:p>
@@ -871,7 +1130,7 @@
         <w:pStyle w:val="ListBullet"/>
       </w:pPr>
       <w:r>
-        <w:t>1. The thesis holds: small models + pipeline produce frontier-quality docs</w:t>
+        <w:t>restructure the schema (gemma4:31b returned an array, then later returned an object)</w:t>
       </w:r>
     </w:p>
     <w:p>
@@ -879,7 +1138,7 @@
         <w:pStyle w:val="ListBullet"/>
       </w:pPr>
       <w:r>
-        <w:t>2. Heavy models are not categorically better — they're more drift-prone</w:t>
+        <w:t>emit chain-of-thought as the response (qwen3.5:35b: Thinking Process: …)</w:t>
       </w:r>
     </w:p>
     <w:p>
@@ -887,7 +1146,52 @@
         <w:pStyle w:val="ListBullet"/>
       </w:pPr>
       <w:r>
+        <w:t>exhaust the token budget inside the thinking phase (glm-4.7-flash empty content in R1)</w:t>
+      </w:r>
+    </w:p>
+    <w:p>
+      <w:r>
+        <w:t>The think: false Ollama-extension parameter helps but isn't 100% effective.</w:t>
+      </w:r>
+    </w:p>
+    <w:p>
+      <w:pPr>
+        <w:pStyle w:val="Heading3"/>
+      </w:pPr>
+      <w:r>
         <w:t>3. qwen3.5:35b is systematically incompatible with strict-output tasks</w:t>
+      </w:r>
+    </w:p>
+    <w:p>
+      <w:r>
+        <w:t>Both R1 and R2 cells 3 failed. R1: 26K tokens of "Thinking Process:" prose. R2: same behaviour but timed out at 600s. With 36B parameters and a heavy reasoning bias, this model is the wrong tool for "emit JSON to this schema."</w:t>
+      </w:r>
+    </w:p>
+    <w:p>
+      <w:r>
+        <w:t xml:space="preserve">For non-frontier-but-needs-structure tasks, prefer </w:t>
+      </w:r>
+      <w:r>
+        <w:rPr>
+          <w:b/>
+        </w:rPr>
+        <w:t>smaller instruction- tuned models</w:t>
+      </w:r>
+      <w:r>
+        <w:t xml:space="preserve"> over larger reasoning-tuned ones. Counter-intuitive but consistently observed across both rounds.</w:t>
+      </w:r>
+    </w:p>
+    <w:p>
+      <w:pPr>
+        <w:pStyle w:val="Heading3"/>
+      </w:pPr>
+      <w:r>
+        <w:t>4. Pipeline throughput</w:t>
+      </w:r>
+    </w:p>
+    <w:p>
+      <w:r>
+        <w:t>The light-tier total wall time across both rounds:</w:t>
       </w:r>
     </w:p>
     <w:p>
@@ -895,78 +1199,79 @@
         <w:pStyle w:val="ListBullet"/>
       </w:pPr>
       <w:r>
-        <w:t>4. Pipeline throughput</w:t>
+        <w:t>R1: 27 + 54 + 60 = 141s for 3 valid docx outputs (≈ 47s/cell)</w:t>
+      </w:r>
+    </w:p>
+    <w:p>
+      <w:pPr>
+        <w:pStyle w:val="ListBullet"/>
+      </w:pPr>
+      <w:r>
+        <w:t>R2: 11 + 30 + 51 = 92s for 3 valid docx outputs (≈ 31s/cell)</w:t>
       </w:r>
     </w:p>
     <w:p>
       <w:r>
-        <w:t>In both rounds, all three light-tier models (4B / 5B / 9.7B) produced a valid klawd-themed `.docx` that passed lenient MP-VALIDATE on the very first attempt. The smallest — Gemma 3 4B — finished in **11 seconds** in R2.</w:t>
+        <w:t xml:space="preserve">Heavy cells when they work are much slower (84–302s) and more variable. For production: </w:t>
       </w:r>
-    </w:p>
-    <w:p>
       <w:r>
-        <w:t>Same models without the pipeline (cells 7 &amp; 8) only produce raw markdown. The deterministic builder + style preset is what turns "model output" into "polished branded document".</w:t>
+        <w:rPr>
+          <w:b/>
+        </w:rPr>
+        <w:t>prefer the light tier</w:t>
       </w:r>
-    </w:p>
-    <w:p>
       <w:r>
-        <w:t>Heavy cells when they work are much slower (84–302s) and more variable.</w:t>
-      </w:r>
-    </w:p>
-    <w:p>
-      <w:r>
-        <w:t>For production: **prefer the light tier** — predictable latency, lower GPU contention, identical end-result quality (the visual fidelity is all in the klawd preset, not the model).</w:t>
+        <w:t xml:space="preserve"> — predictable latency, lower GPU contention, identical end-result quality (the visual fidelity is all in the klawd preset, not the model).</w:t>
       </w:r>
     </w:p>
     <w:p>
       <w:pPr>
-        <w:pStyle w:val="Heading1"/>
+        <w:pStyle w:val="Heading2"/>
       </w:pPr>
       <w:r>
         <w:t>Artifacts</w:t>
       </w:r>
     </w:p>
     <w:p>
+      <w:pPr>
+        <w:pStyle w:val="ListBullet"/>
+      </w:pPr>
       <w:r>
-        <w:t>- `round1/` — full R1 outputs and report</w:t>
+        <w:t>round1/ — full R1 outputs and report</w:t>
       </w:r>
     </w:p>
     <w:p>
+      <w:pPr>
+        <w:pStyle w:val="ListBullet"/>
+      </w:pPr>
       <w:r>
-        <w:t>- `0*.docx`, `0*.md` — R2 outputs (current top-level)</w:t>
+        <w:t>0*.docx, 0*.md — R2 outputs (current top-level)</w:t>
       </w:r>
     </w:p>
     <w:p>
+      <w:pPr>
+        <w:pStyle w:val="ListBullet"/>
+      </w:pPr>
       <w:r>
-        <w:t>- `04_light_gemma3_4b.docx`, `06_light_qwen3_5.docx` — the two cleanest outputs to open and visually compare</w:t>
+        <w:t>04_light_gemma3_4b.docx, 06_light_qwen3_5.docx — the two cleanest outputs to open and visually compare</w:t>
       </w:r>
     </w:p>
     <w:p>
+      <w:pPr>
+        <w:pStyle w:val="ListBullet"/>
+      </w:pPr>
       <w:r>
-        <w:t>- `07_baseline_qwen3_5_35b.md`, `08_baseline_gemma3_4b.md` — what the same models produce when you take MINT out of the loop (markdown, no styling, no .docx, no validation)</w:t>
+        <w:t>07_baseline_qwen3_5_35b.md, 08_baseline_gemma3_4b.md — what the same models produce when you take MINT out of the loop (markdown, no styling, no .docx, no validation)</w:t>
       </w:r>
     </w:p>
     <w:sectPr>
       <w:pgSz w:w="12240" w:h="15840"/>
-      <w:pgMar w:top="1440" w:right="1440" w:bottom="1440" w:left="1440" w:header="720" w:footer="720" w:gutter="0"/>
+      <w:pgMar w:top="1440" w:right="1800" w:bottom="1440" w:left="1800" w:header="720" w:footer="720" w:gutter="0"/>
+      <w:cols w:space="720"/>
       <w:docGrid w:linePitch="360"/>
-      <w:cols w:num="2" w:space="720"/>
     </w:sectPr>
   </w:body>
 </w:document>
-</file>
-
-<file path=word/header1.xml><?xml version="1.0" encoding="utf-8"?>
-<w:hdr xmlns:m="http://schemas.openxmlformats.org/officeDocument/2006/math" xmlns:mc="http://schemas.openxmlformats.org/markup-compatibility/2006" xmlns:mo="http://schemas.microsoft.com/office/mac/office/2008/main" xmlns:mv="urn:schemas-microsoft-com:mac:vml" xmlns:o="urn:schemas-microsoft-com:office:office" xmlns:r="http://schemas.openxmlformats.org/officeDocument/2006/relationships" xmlns:v="urn:schemas-microsoft-com:vml" xmlns:w10="urn:schemas-microsoft-com:office:word" xmlns:w14="http://schemas.microsoft.com/office/word/2010/wordml" xmlns:w="http://schemas.openxmlformats.org/wordprocessingml/2006/main" xmlns:wne="http://schemas.microsoft.com/office/word/2006/wordml" xmlns:wp14="http://schemas.microsoft.com/office/word/2010/wordprocessingDrawing" xmlns:wp="http://schemas.openxmlformats.org/drawingml/2006/wordprocessingDrawing" xmlns:wpc="http://schemas.microsoft.com/office/word/2010/wordprocessingCanvas" xmlns:wpg="http://schemas.microsoft.com/office/word/2010/wordprocessingGroup" xmlns:wpi="http://schemas.microsoft.com/office/word/2010/wordprocessingInk" xmlns:wps="http://schemas.microsoft.com/office/word/2010/wordprocessingShape" mc:Ignorable="w14 wp14">
-  <w:p>
-    <w:pPr>
-      <w:pStyle w:val="Header"/>
-    </w:pPr>
-    <w:r>
-      <w:t>Cell</w:t>
-    </w:r>
-  </w:p>
-</w:hdr>
 </file>
 
 <file path=word/numbering.xml><?xml version="1.0" encoding="utf-8"?>

</xml_diff>